<commit_message>
refactor(reports): add report 1 v1.6 with updated v1.5 context diagram
</commit_message>
<xml_diff>
--- a/.docs/Capstone Reports/Report 1 Project Introduction/Report1_Project_Introduction_v1.6.docx
+++ b/.docs/Capstone Reports/Report 1 Project Introduction/Report1_Project_Introduction_v1.6.docx
@@ -23,7 +23,7 @@
           <wp:inline distB="0" distT="0" distL="0" distR="0">
             <wp:extent cx="2707537" cy="832092"/>
             <wp:effectExtent b="0" l="0" r="0" t="0"/>
-            <wp:docPr id="15" name="image1.png"/>
+            <wp:docPr id="16" name="image1.png"/>
             <a:graphic>
               <a:graphicData uri="http://schemas.openxmlformats.org/drawingml/2006/picture">
                 <pic:pic>
@@ -2376,6 +2376,172 @@
               </w:pBdr>
               <w:spacing w:after="80" w:before="80" w:line="240" w:lineRule="auto"/>
               <w:rPr>
+                <w:sz w:val="18"/>
+                <w:szCs w:val="18"/>
+              </w:rPr>
+            </w:pPr>
+            <w:r>
+              <w:rPr>
+                <w:sz w:val="18"/>
+                <w:szCs w:val="18"/>
+                <w:rtl w:val="0"/>
+              </w:rPr>
+              <w:t xml:space="preserve">27/10/2026</w:t>
+            </w:r>
+          </w:p>
+        </w:tc>
+        <w:tc>
+          <w:tcPr>
+            <w:tcBorders>
+              <w:top w:color="000000" w:space="0" w:sz="4" w:val="single"/>
+              <w:left w:color="000000" w:space="0" w:sz="4" w:val="single"/>
+              <w:bottom w:color="000000" w:space="0" w:sz="4" w:val="single"/>
+              <w:right w:color="000000" w:space="0" w:sz="4" w:val="single"/>
+            </w:tcBorders>
+            <w:tcMar>
+              <w:top w:w="0.0" w:type="dxa"/>
+              <w:left w:w="80.0" w:type="dxa"/>
+              <w:bottom w:w="0.0" w:type="dxa"/>
+              <w:right w:w="80.0" w:type="dxa"/>
+            </w:tcMar>
+          </w:tcPr>
+          <w:p>
+            <w:pPr>
+              <w:pBdr>
+                <w:top w:color="000000" w:space="0" w:sz="0" w:val="none"/>
+                <w:left w:color="000000" w:space="0" w:sz="0" w:val="none"/>
+                <w:bottom w:color="000000" w:space="0" w:sz="0" w:val="none"/>
+                <w:right w:color="000000" w:space="0" w:sz="0" w:val="none"/>
+                <w:between w:color="000000" w:space="0" w:sz="0" w:val="none"/>
+              </w:pBdr>
+              <w:spacing w:after="80" w:before="80" w:line="240" w:lineRule="auto"/>
+              <w:rPr>
+                <w:sz w:val="18"/>
+                <w:szCs w:val="18"/>
+              </w:rPr>
+            </w:pPr>
+            <w:r>
+              <w:rPr>
+                <w:sz w:val="18"/>
+                <w:szCs w:val="18"/>
+                <w:rtl w:val="0"/>
+              </w:rPr>
+              <w:t xml:space="preserve">M</w:t>
+            </w:r>
+          </w:p>
+        </w:tc>
+        <w:tc>
+          <w:tcPr>
+            <w:tcBorders>
+              <w:top w:color="000000" w:space="0" w:sz="4" w:val="single"/>
+              <w:left w:color="000000" w:space="0" w:sz="4" w:val="single"/>
+              <w:bottom w:color="000000" w:space="0" w:sz="4" w:val="single"/>
+              <w:right w:color="000000" w:space="0" w:sz="4" w:val="single"/>
+            </w:tcBorders>
+            <w:tcMar>
+              <w:top w:w="0.0" w:type="dxa"/>
+              <w:left w:w="80.0" w:type="dxa"/>
+              <w:bottom w:w="0.0" w:type="dxa"/>
+              <w:right w:w="80.0" w:type="dxa"/>
+            </w:tcMar>
+          </w:tcPr>
+          <w:p>
+            <w:pPr>
+              <w:pBdr>
+                <w:top w:color="000000" w:space="0" w:sz="0" w:val="none"/>
+                <w:left w:color="000000" w:space="0" w:sz="0" w:val="none"/>
+                <w:bottom w:color="000000" w:space="0" w:sz="0" w:val="none"/>
+                <w:right w:color="000000" w:space="0" w:sz="0" w:val="none"/>
+                <w:between w:color="000000" w:space="0" w:sz="0" w:val="none"/>
+              </w:pBdr>
+              <w:spacing w:after="80" w:before="80" w:line="240" w:lineRule="auto"/>
+              <w:rPr>
+                <w:sz w:val="18"/>
+                <w:szCs w:val="18"/>
+              </w:rPr>
+            </w:pPr>
+            <w:r>
+              <w:rPr>
+                <w:sz w:val="18"/>
+                <w:szCs w:val="18"/>
+                <w:rtl w:val="0"/>
+              </w:rPr>
+              <w:t xml:space="preserve">Truong Le Huy Hoang</w:t>
+            </w:r>
+          </w:p>
+        </w:tc>
+        <w:tc>
+          <w:tcPr>
+            <w:tcBorders>
+              <w:top w:color="000000" w:space="0" w:sz="4" w:val="single"/>
+              <w:left w:color="000000" w:space="0" w:sz="4" w:val="single"/>
+              <w:bottom w:color="000000" w:space="0" w:sz="4" w:val="single"/>
+              <w:right w:color="000000" w:space="0" w:sz="4" w:val="single"/>
+            </w:tcBorders>
+            <w:tcMar>
+              <w:top w:w="0.0" w:type="dxa"/>
+              <w:left w:w="80.0" w:type="dxa"/>
+              <w:bottom w:w="0.0" w:type="dxa"/>
+              <w:right w:w="80.0" w:type="dxa"/>
+            </w:tcMar>
+          </w:tcPr>
+          <w:p>
+            <w:pPr>
+              <w:pBdr>
+                <w:top w:color="000000" w:space="0" w:sz="0" w:val="none"/>
+                <w:left w:color="000000" w:space="0" w:sz="0" w:val="none"/>
+                <w:bottom w:color="000000" w:space="0" w:sz="0" w:val="none"/>
+                <w:right w:color="000000" w:space="0" w:sz="0" w:val="none"/>
+                <w:between w:color="000000" w:space="0" w:sz="0" w:val="none"/>
+              </w:pBdr>
+              <w:spacing w:after="80" w:before="80" w:line="240" w:lineRule="auto"/>
+              <w:rPr>
+                <w:sz w:val="18"/>
+                <w:szCs w:val="18"/>
+              </w:rPr>
+            </w:pPr>
+            <w:r>
+              <w:rPr>
+                <w:sz w:val="18"/>
+                <w:szCs w:val="18"/>
+                <w:rtl w:val="0"/>
+              </w:rPr>
+              <w:t xml:space="preserve">Update Context Diagram version 1.5 based on latest version of topic registration file (version 1.8)</w:t>
+            </w:r>
+          </w:p>
+        </w:tc>
+      </w:tr>
+      <w:tr>
+        <w:trPr>
+          <w:cantSplit w:val="0"/>
+          <w:tblHeader w:val="0"/>
+        </w:trPr>
+        <w:tc>
+          <w:tcPr>
+            <w:tcBorders>
+              <w:top w:color="000000" w:space="0" w:sz="4" w:val="single"/>
+              <w:left w:color="000000" w:space="0" w:sz="4" w:val="single"/>
+              <w:bottom w:color="000000" w:space="0" w:sz="4" w:val="single"/>
+              <w:right w:color="000000" w:space="0" w:sz="4" w:val="single"/>
+            </w:tcBorders>
+            <w:tcMar>
+              <w:top w:w="0.0" w:type="dxa"/>
+              <w:left w:w="80.0" w:type="dxa"/>
+              <w:bottom w:w="0.0" w:type="dxa"/>
+              <w:right w:w="80.0" w:type="dxa"/>
+            </w:tcMar>
+          </w:tcPr>
+          <w:p>
+            <w:pPr>
+              <w:pBdr>
+                <w:top w:color="000000" w:space="0" w:sz="0" w:val="none"/>
+                <w:left w:color="000000" w:space="0" w:sz="0" w:val="none"/>
+                <w:bottom w:color="000000" w:space="0" w:sz="0" w:val="none"/>
+                <w:right w:color="000000" w:space="0" w:sz="0" w:val="none"/>
+                <w:between w:color="000000" w:space="0" w:sz="0" w:val="none"/>
+              </w:pBdr>
+              <w:spacing w:after="80" w:before="80" w:line="240" w:lineRule="auto"/>
+              <w:rPr>
                 <w:color w:val="000000"/>
                 <w:sz w:val="18"/>
                 <w:szCs w:val="18"/>
@@ -5112,9 +5278,9 @@
         <w:rPr/>
         <w:drawing>
           <wp:inline distB="114300" distT="114300" distL="114300" distR="114300">
-            <wp:extent cx="5746440" cy="2819400"/>
+            <wp:extent cx="5746440" cy="3416300"/>
             <wp:effectExtent b="0" l="0" r="0" t="0"/>
-            <wp:docPr id="16" name="image2.png"/>
+            <wp:docPr id="15" name="image2.png"/>
             <a:graphic>
               <a:graphicData uri="http://schemas.openxmlformats.org/drawingml/2006/picture">
                 <pic:pic>
@@ -5132,7 +5298,7 @@
                   <pic:spPr>
                     <a:xfrm>
                       <a:off x="0" y="0"/>
-                      <a:ext cx="5746440" cy="2819400"/>
+                      <a:ext cx="5746440" cy="3416300"/>
                     </a:xfrm>
                     <a:prstGeom prst="rect"/>
                     <a:ln/>

</xml_diff>